<commit_message>
[Update] Adapt to user specific
</commit_message>
<xml_diff>
--- a/docs/LePhucDuc_CV.docx
+++ b/docs/LePhucDuc_CV.docx
@@ -105,19 +105,7 @@
         <w:rPr>
           <w:rFonts w:cs="Times New Roman" w:ascii="Times New Roman" w:hAnsi="Times New Roman"/>
         </w:rPr>
-        <w:t>: C, C</w:t>
-      </w:r>
-      <w:r>
-        <w:rPr>
-          <w:rFonts w:cs="Times New Roman" w:ascii="Times New Roman" w:hAnsi="Times New Roman"/>
-        </w:rPr>
-        <w:t>++</w:t>
-      </w:r>
-      <w:r>
-        <w:rPr>
-          <w:rFonts w:cs="Times New Roman" w:ascii="Times New Roman" w:hAnsi="Times New Roman"/>
-        </w:rPr>
-        <w:t>, Batch script, Python, CAPL</w:t>
+        <w:t>: C, C++, Batch script, Python, CAPL</w:t>
       </w:r>
     </w:p>
     <w:p>
@@ -216,31 +204,7 @@
           <w:b/>
           <w:lang w:val="vi-VN"/>
         </w:rPr>
-        <w:t>20</w:t>
-      </w:r>
-      <w:r>
-        <w:rPr>
-          <w:rFonts w:eastAsia="Times New Roman" w:cs="Times New Roman" w:ascii="Times New Roman" w:hAnsi="Times New Roman"/>
-          <w:b/>
-          <w:lang w:val="vi-VN"/>
-        </w:rPr>
-        <w:t>18</w:t>
-      </w:r>
-      <w:r>
-        <w:rPr>
-          <w:rFonts w:eastAsia="Times New Roman" w:cs="Times New Roman" w:ascii="Times New Roman" w:hAnsi="Times New Roman"/>
-          <w:b/>
-          <w:lang w:val="vi-VN"/>
-        </w:rPr>
-        <w:t xml:space="preserve"> – 20</w:t>
-      </w:r>
-      <w:r>
-        <w:rPr>
-          <w:rFonts w:eastAsia="Times New Roman" w:cs="Times New Roman" w:ascii="Times New Roman" w:hAnsi="Times New Roman"/>
-          <w:b/>
-          <w:lang w:val="vi-VN"/>
-        </w:rPr>
-        <w:t>22</w:t>
+        <w:t>2018 – 2022</w:t>
       </w:r>
     </w:p>
     <w:p>
@@ -270,15 +234,7 @@
           <w:i/>
           <w:lang w:val="vi-VN"/>
         </w:rPr>
-        <w:t xml:space="preserve">in </w:t>
-      </w:r>
-      <w:r>
-        <w:rPr>
-          <w:rFonts w:eastAsia="Times New Roman" w:cs="Times New Roman" w:ascii="Times New Roman" w:hAnsi="Times New Roman"/>
-          <w:i/>
-          <w:lang w:val="vi-VN"/>
-        </w:rPr>
-        <w:t>Automation and Control</w:t>
+        <w:t>in Automation and Control</w:t>
       </w:r>
       <w:r>
         <w:rPr>
@@ -340,31 +296,7 @@
           <w:b/>
           <w:lang w:val="vi-VN"/>
         </w:rPr>
-        <w:t>20</w:t>
-      </w:r>
-      <w:r>
-        <w:rPr>
-          <w:rFonts w:eastAsia="Times New Roman" w:cs="Times New Roman" w:ascii="Times New Roman" w:hAnsi="Times New Roman"/>
-          <w:b/>
-          <w:lang w:val="vi-VN"/>
-        </w:rPr>
-        <w:t>24</w:t>
-      </w:r>
-      <w:r>
-        <w:rPr>
-          <w:rFonts w:eastAsia="Times New Roman" w:cs="Times New Roman" w:ascii="Times New Roman" w:hAnsi="Times New Roman"/>
-          <w:b/>
-          <w:lang w:val="vi-VN"/>
-        </w:rPr>
-        <w:t xml:space="preserve"> – </w:t>
-      </w:r>
-      <w:r>
-        <w:rPr>
-          <w:rFonts w:eastAsia="Times New Roman" w:cs="Times New Roman" w:ascii="Times New Roman" w:hAnsi="Times New Roman"/>
-          <w:b/>
-          <w:lang w:val="vi-VN"/>
-        </w:rPr>
-        <w:t>Present</w:t>
+        <w:t>2024 – Present</w:t>
       </w:r>
     </w:p>
     <w:p>
@@ -386,30 +318,15 @@
           <w:rFonts w:eastAsia="Times New Roman" w:cs="Times New Roman" w:ascii="Times New Roman" w:hAnsi="Times New Roman"/>
           <w:i/>
         </w:rPr>
-        <w:t>Master</w:t>
+        <w:t xml:space="preserve">Master’s Degree </w:t>
       </w:r>
       <w:r>
         <w:rPr>
           <w:rFonts w:eastAsia="Times New Roman" w:cs="Times New Roman" w:ascii="Times New Roman" w:hAnsi="Times New Roman"/>
           <w:i/>
-        </w:rPr>
-        <w:t xml:space="preserve">’s Degree </w:t>
-      </w:r>
-      <w:r>
-        <w:rPr>
-          <w:rFonts w:eastAsia="Times New Roman" w:cs="Times New Roman" w:ascii="Times New Roman" w:hAnsi="Times New Roman"/>
-          <w:i/>
-          <w:lang w:val="vi-VN"/>
-        </w:rPr>
-        <w:t xml:space="preserve">in </w:t>
-      </w:r>
-      <w:r>
-        <w:rPr>
-          <w:rFonts w:eastAsia="Times New Roman" w:cs="Times New Roman" w:ascii="Times New Roman" w:hAnsi="Times New Roman"/>
-          <w:i/>
-          <w:lang w:val="vi-VN"/>
-        </w:rPr>
-        <w:t>Computer Science</w:t>
+          <w:lang w:val="vi-VN"/>
+        </w:rPr>
+        <w:t>in Computer Science</w:t>
       </w:r>
       <w:r>
         <w:rPr>
@@ -536,13 +453,7 @@
         <w:rPr>
           <w:rFonts w:cs="Times New Roman" w:ascii="Times New Roman" w:hAnsi="Times New Roman"/>
         </w:rPr>
-        <w:t xml:space="preserve">: </w:t>
-      </w:r>
-      <w:r>
-        <w:rPr>
-          <w:rFonts w:cs="Times New Roman" w:ascii="Times New Roman" w:hAnsi="Times New Roman"/>
-        </w:rPr>
-        <w:t>Perfectly Keyless System</w:t>
+        <w:t>: Perfectly Keyless System</w:t>
       </w:r>
     </w:p>
     <w:p>
@@ -569,13 +480,7 @@
         <w:rPr>
           <w:rFonts w:cs="Times New Roman" w:ascii="Times New Roman" w:hAnsi="Times New Roman"/>
         </w:rPr>
-        <w:t xml:space="preserve">: </w:t>
-      </w:r>
-      <w:r>
-        <w:rPr>
-          <w:rFonts w:cs="Times New Roman" w:ascii="Times New Roman" w:hAnsi="Times New Roman"/>
-        </w:rPr>
-        <w:t>Honda</w:t>
+        <w:t>: Honda</w:t>
       </w:r>
     </w:p>
     <w:p>
@@ -599,20 +504,7 @@
         </w:rPr>
         <w:t>Software Engineering Supervisor</w:t>
         <w:tab/>
-      </w:r>
-      <w:r>
-        <w:rPr>
-          <w:rFonts w:cs="Times New Roman" w:ascii="Times New Roman" w:hAnsi="Times New Roman"/>
-          <w:b/>
-        </w:rPr>
-        <w:t>Feb</w:t>
-      </w:r>
-      <w:r>
-        <w:rPr>
-          <w:rFonts w:cs="Times New Roman" w:ascii="Times New Roman" w:hAnsi="Times New Roman"/>
-          <w:b/>
-        </w:rPr>
-        <w:t xml:space="preserve"> 2024 – Present</w:t>
+        <w:t>Feb 2024 – Present</w:t>
       </w:r>
     </w:p>
     <w:p>
@@ -843,13 +735,7 @@
         <w:rPr>
           <w:rFonts w:cs="Times New Roman" w:ascii="Times New Roman" w:hAnsi="Times New Roman"/>
         </w:rPr>
-        <w:t xml:space="preserve">Responsible for Software Developer in Master ECU software development </w:t>
-      </w:r>
-      <w:r>
-        <w:rPr>
-          <w:rFonts w:cs="Times New Roman" w:ascii="Times New Roman" w:hAnsi="Times New Roman"/>
-        </w:rPr>
-        <w:t>with SaaP approach.</w:t>
+        <w:t>Responsible for Software Developer in Master ECU software development with SaaP approach.</w:t>
       </w:r>
     </w:p>
     <w:p>
@@ -980,61 +866,15 @@
         </w:rPr>
         <w:t>Software Engineer</w:t>
         <w:tab/>
+        <w:t>June</w:t>
       </w:r>
       <w:r>
         <w:rPr>
           <w:rFonts w:eastAsia="Times New Roman" w:cs="Times New Roman" w:ascii="Times New Roman" w:hAnsi="Times New Roman"/>
           <w:b/>
-        </w:rPr>
-        <w:t>June</w:t>
-      </w:r>
-      <w:r>
-        <w:rPr>
-          <w:rFonts w:eastAsia="Times New Roman" w:cs="Times New Roman" w:ascii="Times New Roman" w:hAnsi="Times New Roman"/>
-          <w:b/>
-          <w:lang w:val="vi-VN"/>
-        </w:rPr>
-        <w:t xml:space="preserve"> 20</w:t>
-      </w:r>
-      <w:r>
-        <w:rPr>
-          <w:rFonts w:eastAsia="Times New Roman" w:cs="Times New Roman" w:ascii="Times New Roman" w:hAnsi="Times New Roman"/>
-          <w:b/>
-          <w:lang w:val="vi-VN"/>
-        </w:rPr>
-        <w:t>22</w:t>
-      </w:r>
-      <w:r>
-        <w:rPr>
-          <w:rFonts w:eastAsia="Times New Roman" w:cs="Times New Roman" w:ascii="Times New Roman" w:hAnsi="Times New Roman"/>
-          <w:b/>
-          <w:lang w:val="vi-VN"/>
-        </w:rPr>
-        <w:t xml:space="preserve"> – </w:t>
-      </w:r>
-      <w:r>
-        <w:rPr>
-          <w:rFonts w:eastAsia="Times New Roman" w:cs="Times New Roman" w:ascii="Times New Roman" w:hAnsi="Times New Roman"/>
-          <w:b/>
-          <w:lang w:val="vi-VN"/>
-        </w:rPr>
-        <w:t>Feb</w:t>
-      </w:r>
-      <w:r>
-        <w:rPr>
-          <w:rFonts w:eastAsia="Times New Roman" w:cs="Times New Roman" w:ascii="Times New Roman" w:hAnsi="Times New Roman"/>
-          <w:b/>
-          <w:lang w:val="vi-VN"/>
-        </w:rPr>
-        <w:t xml:space="preserve"> 202</w:t>
-      </w:r>
-      <w:r>
-        <w:rPr>
-          <w:rFonts w:eastAsia="Times New Roman" w:cs="Times New Roman" w:ascii="Times New Roman" w:hAnsi="Times New Roman"/>
-          <w:b/>
-          <w:lang w:val="vi-VN"/>
-        </w:rPr>
-        <w:t>4</w:t>
+          <w:lang w:val="vi-VN"/>
+        </w:rPr>
+        <w:t xml:space="preserve"> 2022 – Feb 2024</w:t>
       </w:r>
     </w:p>
     <w:p>
@@ -1061,14 +901,7 @@
           <w:rFonts w:cs="Times New Roman" w:ascii="Times New Roman" w:hAnsi="Times New Roman"/>
           <w:lang w:val="vi-VN"/>
         </w:rPr>
-        <w:t xml:space="preserve">Responsible for Software Developer in Master ECU </w:t>
-      </w:r>
-      <w:r>
-        <w:rPr>
-          <w:rFonts w:cs="Times New Roman" w:ascii="Times New Roman" w:hAnsi="Times New Roman"/>
-          <w:lang w:val="vi-VN"/>
-        </w:rPr>
-        <w:t>for Perfectly .</w:t>
+        <w:t>Responsible for Software Developer in Master ECU for Perfectly .</w:t>
       </w:r>
     </w:p>
     <w:p>
@@ -1404,14 +1237,7 @@
           <w:rFonts w:cs="Times New Roman" w:ascii="Times New Roman" w:hAnsi="Times New Roman"/>
           <w:lang w:val="vi-VN"/>
         </w:rPr>
-        <w:t xml:space="preserve">On-site support in </w:t>
-      </w:r>
-      <w:r>
-        <w:rPr>
-          <w:rFonts w:cs="Times New Roman" w:ascii="Times New Roman" w:hAnsi="Times New Roman"/>
-          <w:lang w:val="vi-VN"/>
-        </w:rPr>
-        <w:t>Japan</w:t>
+        <w:t>On-site support in Japan</w:t>
       </w:r>
     </w:p>
     <w:p>

</xml_diff>

<commit_message>
[Update] Update CV with the latest information.
</commit_message>
<xml_diff>
--- a/docs/LePhucDuc_CV.docx
+++ b/docs/LePhucDuc_CV.docx
@@ -128,7 +128,13 @@
         <w:rPr>
           <w:rFonts w:cs="Times New Roman" w:ascii="Times New Roman" w:hAnsi="Times New Roman"/>
         </w:rPr>
-        <w:t>: AUTOSAR Classic, CAN protocol, ASPICE</w:t>
+        <w:t xml:space="preserve">: AUTOSAR Classic, CAN protocol, </w:t>
+      </w:r>
+      <w:r>
+        <w:rPr>
+          <w:rFonts w:cs="Times New Roman" w:ascii="Times New Roman" w:hAnsi="Times New Roman"/>
+        </w:rPr>
+        <w:t>LIN protocol</w:t>
       </w:r>
     </w:p>
     <w:p>
@@ -265,14 +271,7 @@
           <w:rFonts w:eastAsia="Times New Roman" w:cs="Times New Roman" w:ascii="Times New Roman" w:hAnsi="Times New Roman"/>
           <w:bCs/>
         </w:rPr>
-        <w:t>GPA: 7.6/</w:t>
-      </w:r>
-      <w:r>
-        <w:rPr>
-          <w:rFonts w:eastAsia="Times New Roman" w:cs="Times New Roman" w:ascii="Times New Roman" w:hAnsi="Times New Roman"/>
-          <w:bCs/>
-        </w:rPr>
-        <w:t>10</w:t>
+        <w:t>GPA: 7.6/10</w:t>
       </w:r>
     </w:p>
     <w:p>
@@ -556,7 +555,150 @@
         <w:rPr>
           <w:rFonts w:cs="Times New Roman" w:ascii="Times New Roman" w:hAnsi="Times New Roman"/>
         </w:rPr>
-        <w:t>Accountable for overseeing the performance and skill levels of a 12-member software development team working on the Interior Light projects</w:t>
+        <w:t>Responsible for Software Developer in Master ECU software development with SaaP approach.</w:t>
+      </w:r>
+    </w:p>
+    <w:p>
+      <w:pPr>
+        <w:pStyle w:val="ListParagraph"/>
+        <w:numPr>
+          <w:ilvl w:val="0"/>
+          <w:numId w:val="2"/>
+        </w:numPr>
+        <w:tabs>
+          <w:tab w:val="clear" w:pos="720"/>
+          <w:tab w:val="right" w:pos="10426" w:leader="none"/>
+        </w:tabs>
+        <w:spacing w:before="0" w:after="0"/>
+        <w:ind w:hanging="270" w:left="720"/>
+        <w:contextualSpacing/>
+        <w:jc w:val="both"/>
+        <w:rPr>
+          <w:rFonts w:ascii="Times New Roman" w:hAnsi="Times New Roman" w:cs="Times New Roman"/>
+        </w:rPr>
+      </w:pPr>
+      <w:r>
+        <w:rPr>
+          <w:rFonts w:cs="Times New Roman" w:ascii="Times New Roman" w:hAnsi="Times New Roman"/>
+        </w:rPr>
+        <w:t>Proficient in configuring AUTOSAR Basic software, including CommStack, MemStack, CryptoStack and SystemStack.</w:t>
+      </w:r>
+    </w:p>
+    <w:p>
+      <w:pPr>
+        <w:pStyle w:val="ListParagraph"/>
+        <w:numPr>
+          <w:ilvl w:val="0"/>
+          <w:numId w:val="2"/>
+        </w:numPr>
+        <w:tabs>
+          <w:tab w:val="clear" w:pos="720"/>
+          <w:tab w:val="right" w:pos="10426" w:leader="none"/>
+        </w:tabs>
+        <w:spacing w:before="0" w:after="0"/>
+        <w:ind w:hanging="270" w:left="720"/>
+        <w:contextualSpacing/>
+        <w:jc w:val="both"/>
+        <w:rPr>
+          <w:rFonts w:ascii="Times New Roman" w:hAnsi="Times New Roman" w:cs="Times New Roman"/>
+        </w:rPr>
+      </w:pPr>
+      <w:r>
+        <w:rPr>
+          <w:rFonts w:cs="Times New Roman" w:ascii="Times New Roman" w:hAnsi="Times New Roman"/>
+        </w:rPr>
+        <w:t>Proficient in developing AUTOSAR Application software components and RTE configuration.</w:t>
+      </w:r>
+    </w:p>
+    <w:p>
+      <w:pPr>
+        <w:pStyle w:val="ListParagraph"/>
+        <w:numPr>
+          <w:ilvl w:val="0"/>
+          <w:numId w:val="2"/>
+        </w:numPr>
+        <w:tabs>
+          <w:tab w:val="clear" w:pos="720"/>
+          <w:tab w:val="right" w:pos="10426" w:leader="none"/>
+        </w:tabs>
+        <w:spacing w:before="0" w:after="0"/>
+        <w:ind w:hanging="270" w:left="720"/>
+        <w:contextualSpacing/>
+        <w:jc w:val="both"/>
+        <w:rPr>
+          <w:rFonts w:ascii="Times New Roman" w:hAnsi="Times New Roman" w:cs="Times New Roman"/>
+        </w:rPr>
+      </w:pPr>
+      <w:r>
+        <w:rPr>
+          <w:rFonts w:cs="Times New Roman" w:ascii="Times New Roman" w:hAnsi="Times New Roman"/>
+        </w:rPr>
+        <w:t>Creating the platform software to integrate Master Mcu SaaP product.</w:t>
+      </w:r>
+    </w:p>
+    <w:p>
+      <w:pPr>
+        <w:pStyle w:val="ListParagraph"/>
+        <w:numPr>
+          <w:ilvl w:val="1"/>
+          <w:numId w:val="2"/>
+        </w:numPr>
+        <w:tabs>
+          <w:tab w:val="clear" w:pos="720"/>
+          <w:tab w:val="right" w:pos="10426" w:leader="none"/>
+        </w:tabs>
+        <w:spacing w:before="0" w:after="0"/>
+        <w:ind w:hanging="270" w:left="720"/>
+        <w:contextualSpacing/>
+        <w:jc w:val="both"/>
+        <w:rPr>
+          <w:rFonts w:ascii="Times New Roman" w:hAnsi="Times New Roman" w:cs="Times New Roman"/>
+        </w:rPr>
+      </w:pPr>
+      <w:r>
+        <w:rPr>
+          <w:rFonts w:cs="Times New Roman" w:ascii="Times New Roman" w:hAnsi="Times New Roman"/>
+          <w:lang w:val="vi-VN"/>
+        </w:rPr>
+        <w:t>Support to integrate new SIP from Vector.</w:t>
+      </w:r>
+    </w:p>
+    <w:p>
+      <w:pPr>
+        <w:pStyle w:val="ListParagraph"/>
+        <w:numPr>
+          <w:ilvl w:val="0"/>
+          <w:numId w:val="2"/>
+        </w:numPr>
+        <w:tabs>
+          <w:tab w:val="clear" w:pos="720"/>
+          <w:tab w:val="right" w:pos="10426" w:leader="none"/>
+        </w:tabs>
+        <w:spacing w:before="0" w:after="0"/>
+        <w:ind w:hanging="270" w:left="720"/>
+        <w:contextualSpacing/>
+        <w:jc w:val="both"/>
+        <w:rPr>
+          <w:rFonts w:ascii="Times New Roman" w:hAnsi="Times New Roman" w:cs="Times New Roman"/>
+        </w:rPr>
+      </w:pPr>
+      <w:r>
+        <w:rPr>
+          <w:rFonts w:cs="Times New Roman" w:ascii="Times New Roman" w:hAnsi="Times New Roman"/>
+        </w:rPr>
+        <w:t xml:space="preserve">Experienced in Cybersecurity </w:t>
+      </w:r>
+      <w:r>
+        <w:rPr>
+          <w:rFonts w:cs="Times New Roman" w:ascii="Times New Roman" w:hAnsi="Times New Roman"/>
+        </w:rPr>
+        <w:t xml:space="preserve">concept in </w:t>
+      </w:r>
+      <w:r>
+        <w:rPr>
+          <w:rFonts w:cs="Times New Roman" w:ascii="Times New Roman" w:hAnsi="Times New Roman"/>
+        </w:rPr>
+        <w:t>software development.</w:t>
       </w:r>
     </w:p>
     <w:p>
@@ -582,12 +724,71 @@
         <w:rPr>
           <w:rFonts w:cs="Times New Roman" w:ascii="Times New Roman" w:hAnsi="Times New Roman"/>
         </w:rPr>
-        <w:t xml:space="preserve">Led new technical initiatives across various project </w:t>
+        <w:t>Support for DevOps activities in project.</w:t>
       </w:r>
     </w:p>
     <w:p>
       <w:pPr>
         <w:pStyle w:val="ListParagraph"/>
+        <w:widowControl/>
+        <w:numPr>
+          <w:ilvl w:val="1"/>
+          <w:numId w:val="1"/>
+        </w:numPr>
+        <w:tabs>
+          <w:tab w:val="clear" w:pos="720"/>
+          <w:tab w:val="right" w:pos="10426" w:leader="none"/>
+        </w:tabs>
+        <w:suppressAutoHyphens w:val="true"/>
+        <w:bidi w:val="0"/>
+        <w:spacing w:lineRule="auto" w:line="259" w:before="0" w:after="0"/>
+        <w:ind w:hanging="360" w:left="720" w:right="0"/>
+        <w:contextualSpacing/>
+        <w:jc w:val="both"/>
+        <w:rPr>
+          <w:rFonts w:ascii="Times New Roman" w:hAnsi="Times New Roman" w:cs="Times New Roman"/>
+        </w:rPr>
+      </w:pPr>
+      <w:r>
+        <w:rPr>
+          <w:rFonts w:cs="Times New Roman" w:ascii="Times New Roman" w:hAnsi="Times New Roman"/>
+        </w:rPr>
+        <w:t>Setup infrastructure, develop and maintain CI/CT pipeline for project.</w:t>
+      </w:r>
+    </w:p>
+    <w:p>
+      <w:pPr>
+        <w:pStyle w:val="ListParagraph"/>
+        <w:widowControl/>
+        <w:numPr>
+          <w:ilvl w:val="1"/>
+          <w:numId w:val="1"/>
+        </w:numPr>
+        <w:tabs>
+          <w:tab w:val="clear" w:pos="720"/>
+          <w:tab w:val="right" w:pos="10426" w:leader="none"/>
+        </w:tabs>
+        <w:suppressAutoHyphens w:val="true"/>
+        <w:bidi w:val="0"/>
+        <w:spacing w:lineRule="auto" w:line="259" w:before="0" w:after="0"/>
+        <w:ind w:hanging="360" w:left="720" w:right="0"/>
+        <w:contextualSpacing/>
+        <w:jc w:val="both"/>
+        <w:rPr>
+          <w:rFonts w:ascii="Times New Roman" w:hAnsi="Times New Roman" w:cs="Times New Roman"/>
+        </w:rPr>
+      </w:pPr>
+      <w:r>
+        <w:rPr>
+          <w:rFonts w:cs="Times New Roman" w:ascii="Times New Roman" w:hAnsi="Times New Roman"/>
+        </w:rPr>
+        <w:t>Building the framework for clear, functional C document using Doxygen + Sphinx.</w:t>
+      </w:r>
+    </w:p>
+    <w:p>
+      <w:pPr>
+        <w:pStyle w:val="ListParagraph"/>
+        <w:widowControl/>
         <w:numPr>
           <w:ilvl w:val="0"/>
           <w:numId w:val="1"/>
@@ -596,8 +797,10 @@
           <w:tab w:val="clear" w:pos="720"/>
           <w:tab w:val="right" w:pos="10426" w:leader="none"/>
         </w:tabs>
-        <w:spacing w:before="0" w:after="0"/>
-        <w:ind w:hanging="360" w:left="450"/>
+        <w:suppressAutoHyphens w:val="true"/>
+        <w:bidi w:val="0"/>
+        <w:spacing w:lineRule="auto" w:line="259" w:before="0" w:after="0"/>
+        <w:ind w:hanging="360" w:left="449" w:right="0"/>
         <w:contextualSpacing/>
         <w:jc w:val="both"/>
         <w:rPr>
@@ -608,7 +811,190 @@
         <w:rPr>
           <w:rFonts w:cs="Times New Roman" w:ascii="Times New Roman" w:hAnsi="Times New Roman"/>
         </w:rPr>
-        <w:t xml:space="preserve">Guided team members in managing project responsibilities </w:t>
+        <w:t xml:space="preserve">Responsible for Software Developer in </w:t>
+      </w:r>
+      <w:r>
+        <w:rPr>
+          <w:rFonts w:cs="Times New Roman" w:ascii="Times New Roman" w:hAnsi="Times New Roman"/>
+          <w:u w:val="double"/>
+        </w:rPr>
+        <w:t>SDV program.</w:t>
+      </w:r>
+    </w:p>
+    <w:p>
+      <w:pPr>
+        <w:pStyle w:val="ListParagraph"/>
+        <w:widowControl/>
+        <w:numPr>
+          <w:ilvl w:val="1"/>
+          <w:numId w:val="1"/>
+        </w:numPr>
+        <w:tabs>
+          <w:tab w:val="clear" w:pos="720"/>
+          <w:tab w:val="right" w:pos="10426" w:leader="none"/>
+        </w:tabs>
+        <w:suppressAutoHyphens w:val="true"/>
+        <w:bidi w:val="0"/>
+        <w:spacing w:lineRule="auto" w:line="259" w:before="0" w:after="0"/>
+        <w:ind w:hanging="360" w:left="720" w:right="0"/>
+        <w:contextualSpacing/>
+        <w:jc w:val="both"/>
+        <w:rPr>
+          <w:rFonts w:ascii="Times New Roman" w:hAnsi="Times New Roman" w:cs="Times New Roman"/>
+        </w:rPr>
+      </w:pPr>
+      <w:r>
+        <w:rPr>
+          <w:rFonts w:cs="Times New Roman" w:ascii="Times New Roman" w:hAnsi="Times New Roman"/>
+        </w:rPr>
+        <w:t>Define approach, architecture and technologies used for internal SDV program.</w:t>
+      </w:r>
+    </w:p>
+    <w:p>
+      <w:pPr>
+        <w:pStyle w:val="ListParagraph"/>
+        <w:widowControl/>
+        <w:numPr>
+          <w:ilvl w:val="1"/>
+          <w:numId w:val="1"/>
+        </w:numPr>
+        <w:tabs>
+          <w:tab w:val="clear" w:pos="720"/>
+          <w:tab w:val="right" w:pos="10426" w:leader="none"/>
+        </w:tabs>
+        <w:suppressAutoHyphens w:val="true"/>
+        <w:bidi w:val="0"/>
+        <w:spacing w:lineRule="auto" w:line="259" w:before="0" w:after="0"/>
+        <w:ind w:hanging="360" w:left="720" w:right="0"/>
+        <w:contextualSpacing/>
+        <w:jc w:val="both"/>
+        <w:rPr>
+          <w:rFonts w:ascii="Times New Roman" w:hAnsi="Times New Roman" w:cs="Times New Roman"/>
+        </w:rPr>
+      </w:pPr>
+      <w:r>
+        <w:rPr>
+          <w:rFonts w:cs="Times New Roman" w:ascii="Times New Roman" w:hAnsi="Times New Roman"/>
+        </w:rPr>
+        <w:t>C</w:t>
+      </w:r>
+      <w:r>
+        <w:rPr>
+          <w:rFonts w:cs="Times New Roman" w:ascii="Times New Roman" w:hAnsi="Times New Roman"/>
+        </w:rPr>
+        <w:t>ollaborate with ETAS to bring up PK’s features into DreamKit.</w:t>
+      </w:r>
+    </w:p>
+    <w:p>
+      <w:pPr>
+        <w:pStyle w:val="ListParagraph"/>
+        <w:widowControl/>
+        <w:numPr>
+          <w:ilvl w:val="1"/>
+          <w:numId w:val="1"/>
+        </w:numPr>
+        <w:tabs>
+          <w:tab w:val="clear" w:pos="720"/>
+          <w:tab w:val="right" w:pos="10426" w:leader="none"/>
+        </w:tabs>
+        <w:suppressAutoHyphens w:val="true"/>
+        <w:bidi w:val="0"/>
+        <w:spacing w:lineRule="auto" w:line="259" w:before="0" w:after="0"/>
+        <w:ind w:hanging="360" w:left="720" w:right="0"/>
+        <w:contextualSpacing/>
+        <w:jc w:val="both"/>
+        <w:rPr>
+          <w:rFonts w:ascii="Times New Roman" w:hAnsi="Times New Roman" w:cs="Times New Roman"/>
+        </w:rPr>
+      </w:pPr>
+      <w:r>
+        <w:rPr>
+          <w:rFonts w:cs="Times New Roman" w:ascii="Times New Roman" w:hAnsi="Times New Roman"/>
+        </w:rPr>
+        <w:t>Bring up features from Master Mcu’s SaaP to SDV internal platform (Diagnostic, Ranging/Localization).</w:t>
+      </w:r>
+    </w:p>
+    <w:p>
+      <w:pPr>
+        <w:pStyle w:val="ListParagraph"/>
+        <w:widowControl/>
+        <w:numPr>
+          <w:ilvl w:val="1"/>
+          <w:numId w:val="1"/>
+        </w:numPr>
+        <w:tabs>
+          <w:tab w:val="clear" w:pos="720"/>
+          <w:tab w:val="right" w:pos="10426" w:leader="none"/>
+        </w:tabs>
+        <w:suppressAutoHyphens w:val="true"/>
+        <w:bidi w:val="0"/>
+        <w:spacing w:lineRule="auto" w:line="259" w:before="0" w:after="0"/>
+        <w:ind w:hanging="360" w:left="720" w:right="0"/>
+        <w:contextualSpacing/>
+        <w:jc w:val="both"/>
+        <w:rPr>
+          <w:rFonts w:ascii="Times New Roman" w:hAnsi="Times New Roman" w:cs="Times New Roman"/>
+        </w:rPr>
+      </w:pPr>
+      <w:r>
+        <w:rPr>
+          <w:rFonts w:cs="Times New Roman" w:ascii="Times New Roman" w:hAnsi="Times New Roman"/>
+        </w:rPr>
+        <w:t>Experienced in developing and debugging softwares in Linux environment.</w:t>
+      </w:r>
+    </w:p>
+    <w:p>
+      <w:pPr>
+        <w:pStyle w:val="ListParagraph"/>
+        <w:widowControl/>
+        <w:numPr>
+          <w:ilvl w:val="1"/>
+          <w:numId w:val="1"/>
+        </w:numPr>
+        <w:tabs>
+          <w:tab w:val="clear" w:pos="720"/>
+          <w:tab w:val="right" w:pos="10426" w:leader="none"/>
+        </w:tabs>
+        <w:suppressAutoHyphens w:val="true"/>
+        <w:bidi w:val="0"/>
+        <w:spacing w:lineRule="auto" w:line="259" w:before="0" w:after="0"/>
+        <w:ind w:hanging="360" w:left="720" w:right="0"/>
+        <w:contextualSpacing/>
+        <w:jc w:val="both"/>
+        <w:rPr>
+          <w:rFonts w:ascii="Times New Roman" w:hAnsi="Times New Roman" w:cs="Times New Roman"/>
+        </w:rPr>
+      </w:pPr>
+      <w:r>
+        <w:rPr>
+          <w:rFonts w:cs="Times New Roman" w:ascii="Times New Roman" w:hAnsi="Times New Roman"/>
+        </w:rPr>
+        <w:t>Building the pipeline and document framework for SDV.</w:t>
+        <w:tab/>
+      </w:r>
+    </w:p>
+    <w:p>
+      <w:pPr>
+        <w:pStyle w:val="Normal"/>
+        <w:tabs>
+          <w:tab w:val="clear" w:pos="720"/>
+          <w:tab w:val="right" w:pos="10426" w:leader="none"/>
+        </w:tabs>
+        <w:spacing w:before="120" w:after="0"/>
+        <w:jc w:val="both"/>
+        <w:rPr>
+          <w:rFonts w:ascii="Times New Roman" w:hAnsi="Times New Roman" w:cs="Times New Roman"/>
+          <w:b/>
+          <w:lang w:val="vi-VN"/>
+        </w:rPr>
+      </w:pPr>
+      <w:r>
+        <w:rPr>
+          <w:rFonts w:cs="Times New Roman" w:ascii="Times New Roman" w:hAnsi="Times New Roman"/>
+          <w:b/>
+          <w:lang w:val="vi-VN"/>
+        </w:rPr>
+        <w:t>Achievement</w:t>
       </w:r>
     </w:p>
     <w:p>
@@ -616,7 +1002,7 @@
         <w:pStyle w:val="ListParagraph"/>
         <w:numPr>
           <w:ilvl w:val="0"/>
-          <w:numId w:val="1"/>
+          <w:numId w:val="4"/>
         </w:numPr>
         <w:tabs>
           <w:tab w:val="clear" w:pos="720"/>
@@ -628,36 +1014,50 @@
         <w:jc w:val="both"/>
         <w:rPr>
           <w:rFonts w:ascii="Times New Roman" w:hAnsi="Times New Roman" w:cs="Times New Roman"/>
-        </w:rPr>
-      </w:pPr>
-      <w:r>
-        <w:rPr>
-          <w:rFonts w:cs="Times New Roman" w:ascii="Times New Roman" w:hAnsi="Times New Roman"/>
-        </w:rPr>
-        <w:t>Organized training sessions, conducted reviews of completed tasks, and ensured adherence to quality and process standards</w:t>
-      </w:r>
-    </w:p>
-    <w:p>
-      <w:pPr>
-        <w:pStyle w:val="Normal"/>
-        <w:tabs>
-          <w:tab w:val="clear" w:pos="720"/>
-          <w:tab w:val="right" w:pos="10426" w:leader="none"/>
-        </w:tabs>
-        <w:spacing w:before="120" w:after="0"/>
-        <w:rPr>
-          <w:rFonts w:ascii="Times New Roman" w:hAnsi="Times New Roman" w:eastAsia="Times New Roman" w:cs="Times New Roman"/>
-          <w:b/>
-        </w:rPr>
-      </w:pPr>
-      <w:r>
-        <w:rPr>
-          <w:rFonts w:eastAsia="Times New Roman" w:cs="Times New Roman" w:ascii="Times New Roman" w:hAnsi="Times New Roman"/>
-          <w:b/>
-        </w:rPr>
-        <w:t>Software Engineer</w:t>
-        <w:tab/>
-        <w:t>Jan 2021 - Dec 2023</w:t>
+          <w:lang w:val="vi-VN"/>
+        </w:rPr>
+      </w:pPr>
+      <w:r>
+        <w:rPr>
+          <w:rFonts w:cs="Times New Roman" w:ascii="Times New Roman" w:hAnsi="Times New Roman"/>
+          <w:lang w:val="vi-VN"/>
+        </w:rPr>
+        <w:t xml:space="preserve">Acknowledged for contributing to software delivery for </w:t>
+      </w:r>
+      <w:r>
+        <w:rPr>
+          <w:rFonts w:cs="Times New Roman" w:ascii="Times New Roman" w:hAnsi="Times New Roman"/>
+          <w:lang w:val="vi-VN"/>
+        </w:rPr>
+        <w:t>Japan</w:t>
+      </w:r>
+      <w:r>
+        <w:rPr>
+          <w:rFonts w:cs="Times New Roman" w:ascii="Times New Roman" w:hAnsi="Times New Roman"/>
+          <w:lang w:val="vi-VN"/>
+        </w:rPr>
+        <w:t xml:space="preserve"> customer (</w:t>
+      </w:r>
+      <w:r>
+        <w:rPr>
+          <w:rFonts w:cs="Times New Roman" w:ascii="Times New Roman" w:hAnsi="Times New Roman"/>
+          <w:lang w:val="vi-VN"/>
+        </w:rPr>
+        <w:t>Honda, ALAP</w:t>
+      </w:r>
+      <w:r>
+        <w:rPr>
+          <w:rFonts w:cs="Times New Roman" w:ascii="Times New Roman" w:hAnsi="Times New Roman"/>
+          <w:lang w:val="vi-VN"/>
+        </w:rPr>
+        <w:t xml:space="preserve">) </w:t>
+      </w:r>
+      <w:r>
+        <w:rPr>
+          <w:rFonts w:cs="Times New Roman" w:ascii="Times New Roman" w:hAnsi="Times New Roman"/>
+          <w:lang w:val="vi-VN"/>
+        </w:rPr>
+        <w:t>for 2 consecutive releases.</w:t>
       </w:r>
     </w:p>
     <w:p>
@@ -665,7 +1065,7 @@
         <w:pStyle w:val="ListParagraph"/>
         <w:numPr>
           <w:ilvl w:val="0"/>
-          <w:numId w:val="2"/>
+          <w:numId w:val="4"/>
         </w:numPr>
         <w:tabs>
           <w:tab w:val="clear" w:pos="720"/>
@@ -682,8 +1082,159 @@
       <w:r>
         <w:rPr>
           <w:rFonts w:cs="Times New Roman" w:ascii="Times New Roman" w:hAnsi="Times New Roman"/>
-        </w:rPr>
-        <w:t>Responsible for Software Project Coordinator in Master ECU software development</w:t>
+          <w:lang w:val="vi-VN"/>
+        </w:rPr>
+        <w:t>Successfully building a platform software to integrate SaaP product which contributed to the validating process of both VnV and Developer team.</w:t>
+      </w:r>
+    </w:p>
+    <w:p>
+      <w:pPr>
+        <w:pStyle w:val="ListParagraph"/>
+        <w:numPr>
+          <w:ilvl w:val="0"/>
+          <w:numId w:val="4"/>
+        </w:numPr>
+        <w:tabs>
+          <w:tab w:val="clear" w:pos="720"/>
+          <w:tab w:val="right" w:pos="10426" w:leader="none"/>
+        </w:tabs>
+        <w:spacing w:before="0" w:after="0"/>
+        <w:ind w:hanging="360" w:left="450"/>
+        <w:contextualSpacing/>
+        <w:jc w:val="both"/>
+        <w:rPr>
+          <w:rFonts w:ascii="Times New Roman" w:hAnsi="Times New Roman" w:cs="Times New Roman"/>
+          <w:lang w:val="vi-VN"/>
+        </w:rPr>
+      </w:pPr>
+      <w:r>
+        <w:rPr>
+          <w:rFonts w:cs="Times New Roman" w:ascii="Times New Roman" w:hAnsi="Times New Roman"/>
+          <w:lang w:val="vi-VN"/>
+        </w:rPr>
+        <w:t>Acknowledged for successfully bring up features from PK to SDV platform.</w:t>
+      </w:r>
+    </w:p>
+    <w:p>
+      <w:pPr>
+        <w:pStyle w:val="ListParagraph"/>
+        <w:numPr>
+          <w:ilvl w:val="0"/>
+          <w:numId w:val="0"/>
+        </w:numPr>
+        <w:tabs>
+          <w:tab w:val="clear" w:pos="720"/>
+          <w:tab w:val="right" w:pos="10426" w:leader="none"/>
+        </w:tabs>
+        <w:spacing w:before="0" w:after="0"/>
+        <w:ind w:hanging="0" w:left="450"/>
+        <w:contextualSpacing/>
+        <w:jc w:val="both"/>
+        <w:rPr/>
+      </w:pPr>
+      <w:r>
+        <w:rPr/>
+      </w:r>
+    </w:p>
+    <w:p>
+      <w:pPr>
+        <w:pStyle w:val="Normal"/>
+        <w:tabs>
+          <w:tab w:val="clear" w:pos="720"/>
+          <w:tab w:val="right" w:pos="10426" w:leader="none"/>
+        </w:tabs>
+        <w:spacing w:before="0" w:after="0"/>
+        <w:jc w:val="both"/>
+        <w:rPr>
+          <w:rFonts w:ascii="Times New Roman" w:hAnsi="Times New Roman" w:cs="Times New Roman"/>
+        </w:rPr>
+      </w:pPr>
+      <w:r>
+        <w:rPr>
+          <w:rFonts w:cs="Times New Roman" w:ascii="Times New Roman" w:hAnsi="Times New Roman"/>
+          <w:b/>
+        </w:rPr>
+        <w:t>Product</w:t>
+      </w:r>
+      <w:r>
+        <w:rPr>
+          <w:rFonts w:cs="Times New Roman" w:ascii="Times New Roman" w:hAnsi="Times New Roman"/>
+        </w:rPr>
+        <w:t xml:space="preserve">: Perfectly Keyless System </w:t>
+      </w:r>
+      <w:r>
+        <w:rPr>
+          <w:rFonts w:cs="Times New Roman" w:ascii="Times New Roman" w:hAnsi="Times New Roman"/>
+        </w:rPr>
+        <w:t>for Fleet Management Extended Access.</w:t>
+      </w:r>
+    </w:p>
+    <w:p>
+      <w:pPr>
+        <w:pStyle w:val="Normal"/>
+        <w:tabs>
+          <w:tab w:val="clear" w:pos="720"/>
+          <w:tab w:val="right" w:pos="10426" w:leader="none"/>
+        </w:tabs>
+        <w:spacing w:before="0" w:after="0"/>
+        <w:jc w:val="both"/>
+        <w:rPr>
+          <w:rFonts w:ascii="Times New Roman" w:hAnsi="Times New Roman" w:cs="Times New Roman"/>
+        </w:rPr>
+      </w:pPr>
+      <w:r>
+        <w:rPr>
+          <w:rFonts w:cs="Times New Roman" w:ascii="Times New Roman" w:hAnsi="Times New Roman"/>
+          <w:b/>
+        </w:rPr>
+        <w:t>Customer</w:t>
+      </w:r>
+      <w:r>
+        <w:rPr>
+          <w:rFonts w:cs="Times New Roman" w:ascii="Times New Roman" w:hAnsi="Times New Roman"/>
+        </w:rPr>
+        <w:t xml:space="preserve">: </w:t>
+      </w:r>
+      <w:r>
+        <w:rPr>
+          <w:rFonts w:cs="Times New Roman" w:ascii="Times New Roman" w:hAnsi="Times New Roman"/>
+        </w:rPr>
+        <w:t>CV (Commercial Vehicle)</w:t>
+      </w:r>
+    </w:p>
+    <w:p>
+      <w:pPr>
+        <w:pStyle w:val="Normal"/>
+        <w:tabs>
+          <w:tab w:val="clear" w:pos="720"/>
+          <w:tab w:val="right" w:pos="10426" w:leader="none"/>
+        </w:tabs>
+        <w:spacing w:before="120" w:after="0"/>
+        <w:jc w:val="both"/>
+        <w:rPr>
+          <w:rFonts w:ascii="Times New Roman" w:hAnsi="Times New Roman" w:eastAsia="Times New Roman" w:cs="Times New Roman"/>
+          <w:b/>
+          <w:lang w:val="vi-VN"/>
+        </w:rPr>
+      </w:pPr>
+      <w:bookmarkStart w:id="0" w:name="_GoBack"/>
+      <w:bookmarkEnd w:id="0"/>
+      <w:r>
+        <w:rPr>
+          <w:rFonts w:eastAsia="Times New Roman" w:cs="Times New Roman" w:ascii="Times New Roman" w:hAnsi="Times New Roman"/>
+          <w:b/>
+        </w:rPr>
+        <w:t>Software Engineer</w:t>
+        <w:tab/>
+        <w:t>June</w:t>
+      </w:r>
+      <w:r>
+        <w:rPr>
+          <w:rFonts w:eastAsia="Times New Roman" w:cs="Times New Roman" w:ascii="Times New Roman" w:hAnsi="Times New Roman"/>
+          <w:b/>
+          <w:lang w:val="vi-VN"/>
+        </w:rPr>
+        <w:t xml:space="preserve"> 2022 – Feb 2024</w:t>
       </w:r>
     </w:p>
     <w:p>
@@ -698,7 +1249,7 @@
           <w:tab w:val="right" w:pos="10426" w:leader="none"/>
         </w:tabs>
         <w:spacing w:before="0" w:after="0"/>
-        <w:ind w:hanging="270" w:left="720"/>
+        <w:ind w:hanging="360" w:left="450"/>
         <w:contextualSpacing/>
         <w:jc w:val="both"/>
         <w:rPr>
@@ -708,8 +1259,104 @@
       <w:r>
         <w:rPr>
           <w:rFonts w:cs="Times New Roman" w:ascii="Times New Roman" w:hAnsi="Times New Roman"/>
-        </w:rPr>
-        <w:t>Managed activities among stakeholders in Germany, including the System Engineer, Software Project Leader and Customer, as well as the development team in Vietnam</w:t>
+          <w:lang w:val="vi-VN"/>
+        </w:rPr>
+        <w:t>Responsible for Software Developer in Master ECU for Perfectly Keyless System’</w:t>
+      </w:r>
+      <w:r>
+        <w:rPr>
+          <w:rFonts w:cs="Times New Roman" w:ascii="Times New Roman" w:hAnsi="Times New Roman"/>
+          <w:lang w:val="vi-VN"/>
+        </w:rPr>
+        <w:t>s platform project</w:t>
+      </w:r>
+      <w:r>
+        <w:rPr>
+          <w:rFonts w:cs="Times New Roman" w:ascii="Times New Roman" w:hAnsi="Times New Roman"/>
+          <w:lang w:val="vi-VN"/>
+        </w:rPr>
+        <w:t>.</w:t>
+      </w:r>
+    </w:p>
+    <w:p>
+      <w:pPr>
+        <w:pStyle w:val="ListParagraph"/>
+        <w:numPr>
+          <w:ilvl w:val="1"/>
+          <w:numId w:val="3"/>
+        </w:numPr>
+        <w:tabs>
+          <w:tab w:val="clear" w:pos="720"/>
+          <w:tab w:val="right" w:pos="10426" w:leader="none"/>
+        </w:tabs>
+        <w:spacing w:before="0" w:after="0"/>
+        <w:ind w:hanging="360" w:left="720"/>
+        <w:contextualSpacing/>
+        <w:jc w:val="both"/>
+        <w:rPr>
+          <w:rFonts w:ascii="Times New Roman" w:hAnsi="Times New Roman" w:cs="Times New Roman"/>
+        </w:rPr>
+      </w:pPr>
+      <w:r>
+        <w:rPr>
+          <w:rFonts w:cs="Times New Roman" w:ascii="Times New Roman" w:hAnsi="Times New Roman"/>
+          <w:lang w:val="vi-VN"/>
+        </w:rPr>
+        <w:t>Configuring AUTOSAR Application software components and RTE configuration.</w:t>
+      </w:r>
+    </w:p>
+    <w:p>
+      <w:pPr>
+        <w:pStyle w:val="ListParagraph"/>
+        <w:numPr>
+          <w:ilvl w:val="1"/>
+          <w:numId w:val="3"/>
+        </w:numPr>
+        <w:tabs>
+          <w:tab w:val="clear" w:pos="720"/>
+          <w:tab w:val="right" w:pos="10426" w:leader="none"/>
+        </w:tabs>
+        <w:spacing w:before="0" w:after="0"/>
+        <w:ind w:hanging="360" w:left="720"/>
+        <w:contextualSpacing/>
+        <w:jc w:val="both"/>
+        <w:rPr>
+          <w:rFonts w:ascii="Times New Roman" w:hAnsi="Times New Roman" w:cs="Times New Roman"/>
+        </w:rPr>
+      </w:pPr>
+      <w:r>
+        <w:rPr>
+          <w:rFonts w:cs="Times New Roman" w:ascii="Times New Roman" w:hAnsi="Times New Roman"/>
+          <w:lang w:val="vi-VN"/>
+        </w:rPr>
+        <w:t>Support to integrate new SIP from Vector and support to debug problem in SIP package.</w:t>
+      </w:r>
+    </w:p>
+    <w:p>
+      <w:pPr>
+        <w:pStyle w:val="ListParagraph"/>
+        <w:numPr>
+          <w:ilvl w:val="1"/>
+          <w:numId w:val="3"/>
+        </w:numPr>
+        <w:tabs>
+          <w:tab w:val="clear" w:pos="720"/>
+          <w:tab w:val="right" w:pos="10426" w:leader="none"/>
+        </w:tabs>
+        <w:spacing w:before="0" w:after="0"/>
+        <w:ind w:hanging="360" w:left="720"/>
+        <w:contextualSpacing/>
+        <w:jc w:val="both"/>
+        <w:rPr>
+          <w:rFonts w:ascii="Times New Roman" w:hAnsi="Times New Roman" w:cs="Times New Roman"/>
+        </w:rPr>
+      </w:pPr>
+      <w:r>
+        <w:rPr>
+          <w:rFonts w:cs="Times New Roman" w:ascii="Times New Roman" w:hAnsi="Times New Roman"/>
+          <w:lang w:val="vi-VN"/>
+        </w:rPr>
+        <w:t>Understanding CCC (Car Connectivity Consortium).</w:t>
       </w:r>
     </w:p>
     <w:p>
@@ -724,18 +1371,20 @@
           <w:tab w:val="right" w:pos="10426" w:leader="none"/>
         </w:tabs>
         <w:spacing w:before="0" w:after="0"/>
-        <w:ind w:hanging="270" w:left="720"/>
+        <w:ind w:hanging="360" w:left="450"/>
         <w:contextualSpacing/>
         <w:jc w:val="both"/>
         <w:rPr>
           <w:rFonts w:ascii="Times New Roman" w:hAnsi="Times New Roman" w:cs="Times New Roman"/>
-        </w:rPr>
-      </w:pPr>
-      <w:r>
-        <w:rPr>
-          <w:rFonts w:cs="Times New Roman" w:ascii="Times New Roman" w:hAnsi="Times New Roman"/>
-        </w:rPr>
-        <w:t>Supported Software Project Leader to create and maintain software release plan, software schedule and software release notes</w:t>
+          <w:lang w:val="vi-VN"/>
+        </w:rPr>
+      </w:pPr>
+      <w:r>
+        <w:rPr>
+          <w:rFonts w:cs="Times New Roman" w:ascii="Times New Roman" w:hAnsi="Times New Roman"/>
+          <w:lang w:val="vi-VN"/>
+        </w:rPr>
+        <w:t>Proficient in developing Application software components and configuring Basic software for Airbag product</w:t>
       </w:r>
     </w:p>
     <w:p>
@@ -743,7 +1392,7 @@
         <w:pStyle w:val="ListParagraph"/>
         <w:numPr>
           <w:ilvl w:val="0"/>
-          <w:numId w:val="2"/>
+          <w:numId w:val="3"/>
         </w:numPr>
         <w:tabs>
           <w:tab w:val="clear" w:pos="720"/>
@@ -755,13 +1404,68 @@
         <w:jc w:val="both"/>
         <w:rPr>
           <w:rFonts w:ascii="Times New Roman" w:hAnsi="Times New Roman" w:cs="Times New Roman"/>
-        </w:rPr>
-      </w:pPr>
-      <w:r>
-        <w:rPr>
-          <w:rFonts w:cs="Times New Roman" w:ascii="Times New Roman" w:hAnsi="Times New Roman"/>
-        </w:rPr>
-        <w:t>Responsible for Software Developer in Master ECU software development with SaaP approach.</w:t>
+          <w:lang w:val="vi-VN"/>
+        </w:rPr>
+      </w:pPr>
+      <w:r>
+        <w:rPr>
+          <w:rFonts w:cs="Times New Roman" w:ascii="Times New Roman" w:hAnsi="Times New Roman"/>
+          <w:lang w:val="vi-VN"/>
+        </w:rPr>
+        <w:t>Establised CI/CT pipeline for project (integrating build process, unit test upto system test and reporting).</w:t>
+      </w:r>
+    </w:p>
+    <w:p>
+      <w:pPr>
+        <w:pStyle w:val="ListParagraph"/>
+        <w:numPr>
+          <w:ilvl w:val="0"/>
+          <w:numId w:val="3"/>
+        </w:numPr>
+        <w:tabs>
+          <w:tab w:val="clear" w:pos="720"/>
+          <w:tab w:val="right" w:pos="10426" w:leader="none"/>
+        </w:tabs>
+        <w:spacing w:before="0" w:after="0"/>
+        <w:ind w:hanging="360" w:left="450"/>
+        <w:contextualSpacing/>
+        <w:jc w:val="both"/>
+        <w:rPr>
+          <w:rFonts w:ascii="Times New Roman" w:hAnsi="Times New Roman" w:cs="Times New Roman"/>
+          <w:lang w:val="vi-VN"/>
+        </w:rPr>
+      </w:pPr>
+      <w:r>
+        <w:rPr>
+          <w:rFonts w:cs="Times New Roman" w:ascii="Times New Roman" w:hAnsi="Times New Roman"/>
+          <w:lang w:val="vi-VN"/>
+        </w:rPr>
+        <w:t>Responsible for developing door lock/unlock feature for Master Mcu using LIN.</w:t>
+        <w:tab/>
+      </w:r>
+    </w:p>
+    <w:p>
+      <w:pPr>
+        <w:pStyle w:val="Normal"/>
+        <w:tabs>
+          <w:tab w:val="clear" w:pos="720"/>
+          <w:tab w:val="right" w:pos="10426" w:leader="none"/>
+        </w:tabs>
+        <w:spacing w:before="120" w:after="0"/>
+        <w:jc w:val="both"/>
+        <w:rPr>
+          <w:rFonts w:ascii="Times New Roman" w:hAnsi="Times New Roman" w:cs="Times New Roman"/>
+          <w:b/>
+          <w:lang w:val="vi-VN"/>
+        </w:rPr>
+      </w:pPr>
+      <w:r>
+        <w:rPr>
+          <w:rFonts w:cs="Times New Roman" w:ascii="Times New Roman" w:hAnsi="Times New Roman"/>
+          <w:b/>
+          <w:lang w:val="vi-VN"/>
+        </w:rPr>
+        <w:t>Achievement</w:t>
       </w:r>
     </w:p>
     <w:p>
@@ -776,588 +1480,20 @@
           <w:tab w:val="right" w:pos="10426" w:leader="none"/>
         </w:tabs>
         <w:spacing w:before="0" w:after="0"/>
-        <w:ind w:hanging="270" w:left="720"/>
-        <w:contextualSpacing/>
-        <w:jc w:val="both"/>
-        <w:rPr>
-          <w:rFonts w:ascii="Times New Roman" w:hAnsi="Times New Roman" w:cs="Times New Roman"/>
-        </w:rPr>
-      </w:pPr>
-      <w:r>
-        <w:rPr>
-          <w:rFonts w:cs="Times New Roman" w:ascii="Times New Roman" w:hAnsi="Times New Roman"/>
-        </w:rPr>
-        <w:t>Proficient in configuring AUTOSAR Basic software, including CommStack, MemStack, CryptoStack and SystemStack</w:t>
-      </w:r>
-    </w:p>
-    <w:p>
-      <w:pPr>
-        <w:pStyle w:val="ListParagraph"/>
-        <w:numPr>
-          <w:ilvl w:val="0"/>
-          <w:numId w:val="4"/>
-        </w:numPr>
-        <w:tabs>
-          <w:tab w:val="clear" w:pos="720"/>
-          <w:tab w:val="right" w:pos="10426" w:leader="none"/>
-        </w:tabs>
-        <w:spacing w:before="0" w:after="0"/>
-        <w:ind w:hanging="270" w:left="720"/>
-        <w:contextualSpacing/>
-        <w:jc w:val="both"/>
-        <w:rPr>
-          <w:rFonts w:ascii="Times New Roman" w:hAnsi="Times New Roman" w:cs="Times New Roman"/>
-        </w:rPr>
-      </w:pPr>
-      <w:r>
-        <w:rPr>
-          <w:rFonts w:cs="Times New Roman" w:ascii="Times New Roman" w:hAnsi="Times New Roman"/>
-        </w:rPr>
-        <w:t>Proficient in developing AUTOSAR Application software components and RTE configuration.</w:t>
-      </w:r>
-    </w:p>
-    <w:p>
-      <w:pPr>
-        <w:pStyle w:val="ListParagraph"/>
-        <w:numPr>
-          <w:ilvl w:val="0"/>
-          <w:numId w:val="4"/>
-        </w:numPr>
-        <w:tabs>
-          <w:tab w:val="clear" w:pos="720"/>
-          <w:tab w:val="right" w:pos="10426" w:leader="none"/>
-        </w:tabs>
-        <w:spacing w:before="0" w:after="0"/>
-        <w:ind w:hanging="270" w:left="720"/>
-        <w:contextualSpacing/>
-        <w:jc w:val="both"/>
-        <w:rPr>
-          <w:rFonts w:ascii="Times New Roman" w:hAnsi="Times New Roman" w:cs="Times New Roman"/>
-        </w:rPr>
-      </w:pPr>
-      <w:r>
-        <w:rPr>
-          <w:rFonts w:cs="Times New Roman" w:ascii="Times New Roman" w:hAnsi="Times New Roman"/>
-        </w:rPr>
-        <w:t>Experienced in Cybersecurity software development</w:t>
-      </w:r>
-    </w:p>
-    <w:p>
-      <w:pPr>
-        <w:pStyle w:val="ListParagraph"/>
-        <w:numPr>
-          <w:ilvl w:val="0"/>
-          <w:numId w:val="2"/>
-        </w:numPr>
-        <w:tabs>
-          <w:tab w:val="clear" w:pos="720"/>
-          <w:tab w:val="right" w:pos="10426" w:leader="none"/>
-        </w:tabs>
-        <w:spacing w:before="0" w:after="0"/>
         <w:ind w:hanging="360" w:left="450"/>
         <w:contextualSpacing/>
         <w:jc w:val="both"/>
         <w:rPr>
           <w:rFonts w:ascii="Times New Roman" w:hAnsi="Times New Roman" w:cs="Times New Roman"/>
-        </w:rPr>
-      </w:pPr>
-      <w:r>
-        <w:rPr>
-          <w:rFonts w:cs="Times New Roman" w:ascii="Times New Roman" w:hAnsi="Times New Roman"/>
-        </w:rPr>
-        <w:t>Competent in ensuring software compliance with V-model and ASPICE standards</w:t>
-      </w:r>
-    </w:p>
-    <w:p>
-      <w:pPr>
-        <w:pStyle w:val="Normal"/>
-        <w:tabs>
-          <w:tab w:val="clear" w:pos="720"/>
-          <w:tab w:val="right" w:pos="10426" w:leader="none"/>
-        </w:tabs>
-        <w:spacing w:before="120" w:after="0"/>
-        <w:jc w:val="both"/>
-        <w:rPr>
-          <w:rFonts w:ascii="Times New Roman" w:hAnsi="Times New Roman" w:eastAsia="Times New Roman" w:cs="Times New Roman"/>
-          <w:b/>
-          <w:lang w:val="vi-VN"/>
-        </w:rPr>
-      </w:pPr>
-      <w:bookmarkStart w:id="0" w:name="_GoBack"/>
-      <w:bookmarkEnd w:id="0"/>
-      <w:r>
-        <w:rPr>
-          <w:rFonts w:eastAsia="Times New Roman" w:cs="Times New Roman" w:ascii="Times New Roman" w:hAnsi="Times New Roman"/>
-          <w:b/>
-        </w:rPr>
-        <w:t>Software Engineer</w:t>
-        <w:tab/>
-        <w:t>June</w:t>
-      </w:r>
-      <w:r>
-        <w:rPr>
-          <w:rFonts w:eastAsia="Times New Roman" w:cs="Times New Roman" w:ascii="Times New Roman" w:hAnsi="Times New Roman"/>
-          <w:b/>
-          <w:lang w:val="vi-VN"/>
-        </w:rPr>
-        <w:t xml:space="preserve"> 2022 – Feb 2024</w:t>
-      </w:r>
-    </w:p>
-    <w:p>
-      <w:pPr>
-        <w:pStyle w:val="ListParagraph"/>
-        <w:numPr>
-          <w:ilvl w:val="0"/>
-          <w:numId w:val="5"/>
-        </w:numPr>
-        <w:tabs>
-          <w:tab w:val="clear" w:pos="720"/>
-          <w:tab w:val="right" w:pos="10426" w:leader="none"/>
-        </w:tabs>
-        <w:spacing w:before="0" w:after="0"/>
-        <w:ind w:hanging="360" w:left="450"/>
-        <w:contextualSpacing/>
-        <w:jc w:val="both"/>
-        <w:rPr>
-          <w:rFonts w:ascii="Times New Roman" w:hAnsi="Times New Roman" w:cs="Times New Roman"/>
-        </w:rPr>
-      </w:pPr>
-      <w:r>
-        <w:rPr>
-          <w:rFonts w:cs="Times New Roman" w:ascii="Times New Roman" w:hAnsi="Times New Roman"/>
-          <w:lang w:val="vi-VN"/>
-        </w:rPr>
-        <w:t xml:space="preserve">Responsible for Software Developer in Master ECU for Perfectly </w:t>
-      </w:r>
-      <w:r>
-        <w:rPr>
-          <w:rFonts w:cs="Times New Roman" w:ascii="Times New Roman" w:hAnsi="Times New Roman"/>
-          <w:lang w:val="vi-VN"/>
-        </w:rPr>
-        <w:t>Keyless System</w:t>
-      </w:r>
-      <w:r>
-        <w:rPr>
-          <w:rFonts w:cs="Times New Roman" w:ascii="Times New Roman" w:hAnsi="Times New Roman"/>
-          <w:lang w:val="vi-VN"/>
-        </w:rPr>
-        <w:t>.</w:t>
-      </w:r>
-    </w:p>
-    <w:p>
-      <w:pPr>
-        <w:pStyle w:val="ListParagraph"/>
-        <w:numPr>
-          <w:ilvl w:val="0"/>
-          <w:numId w:val="5"/>
-        </w:numPr>
-        <w:tabs>
-          <w:tab w:val="clear" w:pos="720"/>
-          <w:tab w:val="right" w:pos="10426" w:leader="none"/>
-        </w:tabs>
-        <w:spacing w:before="0" w:after="0"/>
-        <w:ind w:hanging="360" w:left="450"/>
-        <w:contextualSpacing/>
-        <w:jc w:val="both"/>
-        <w:rPr>
-          <w:rFonts w:ascii="Times New Roman" w:hAnsi="Times New Roman" w:cs="Times New Roman"/>
-          <w:lang w:val="vi-VN"/>
-        </w:rPr>
-      </w:pPr>
-      <w:r>
-        <w:rPr>
-          <w:rFonts w:cs="Times New Roman" w:ascii="Times New Roman" w:hAnsi="Times New Roman"/>
-          <w:lang w:val="vi-VN"/>
-        </w:rPr>
-        <w:t>Managed activities among stakeholders from China, India and Vietnam to ensure rapid project plan throughput, quality release.</w:t>
-      </w:r>
-    </w:p>
-    <w:p>
-      <w:pPr>
-        <w:pStyle w:val="ListParagraph"/>
-        <w:numPr>
-          <w:ilvl w:val="0"/>
-          <w:numId w:val="5"/>
-        </w:numPr>
-        <w:tabs>
-          <w:tab w:val="clear" w:pos="720"/>
-          <w:tab w:val="right" w:pos="10426" w:leader="none"/>
-        </w:tabs>
-        <w:spacing w:before="0" w:after="0"/>
-        <w:ind w:hanging="360" w:left="450"/>
-        <w:contextualSpacing/>
-        <w:jc w:val="both"/>
-        <w:rPr>
-          <w:rFonts w:ascii="Times New Roman" w:hAnsi="Times New Roman" w:cs="Times New Roman"/>
-          <w:lang w:val="vi-VN"/>
-        </w:rPr>
-      </w:pPr>
-      <w:r>
-        <w:rPr>
-          <w:rFonts w:cs="Times New Roman" w:ascii="Times New Roman" w:hAnsi="Times New Roman"/>
-          <w:lang w:val="vi-VN"/>
-        </w:rPr>
-        <w:t>Proficient in developing Application software components and configuring Basic software for Airbag product</w:t>
-      </w:r>
-    </w:p>
-    <w:p>
-      <w:pPr>
-        <w:pStyle w:val="ListParagraph"/>
-        <w:numPr>
-          <w:ilvl w:val="0"/>
-          <w:numId w:val="5"/>
-        </w:numPr>
-        <w:tabs>
-          <w:tab w:val="clear" w:pos="720"/>
-          <w:tab w:val="right" w:pos="10426" w:leader="none"/>
-        </w:tabs>
-        <w:spacing w:before="0" w:after="0"/>
-        <w:ind w:hanging="360" w:left="450"/>
-        <w:contextualSpacing/>
-        <w:jc w:val="both"/>
-        <w:rPr>
-          <w:rFonts w:ascii="Times New Roman" w:hAnsi="Times New Roman" w:cs="Times New Roman"/>
-          <w:lang w:val="vi-VN"/>
-        </w:rPr>
-      </w:pPr>
-      <w:r>
-        <w:rPr>
-          <w:rFonts w:cs="Times New Roman" w:ascii="Times New Roman" w:hAnsi="Times New Roman"/>
-          <w:lang w:val="vi-VN"/>
-        </w:rPr>
-        <w:t>Managed entire Software Development Life Cycle:</w:t>
-      </w:r>
-    </w:p>
-    <w:p>
-      <w:pPr>
-        <w:pStyle w:val="ListParagraph"/>
-        <w:numPr>
-          <w:ilvl w:val="0"/>
-          <w:numId w:val="6"/>
-        </w:numPr>
-        <w:tabs>
-          <w:tab w:val="clear" w:pos="720"/>
-          <w:tab w:val="right" w:pos="10426" w:leader="none"/>
-        </w:tabs>
-        <w:spacing w:before="0" w:after="0"/>
-        <w:ind w:hanging="270" w:left="720"/>
-        <w:contextualSpacing/>
-        <w:jc w:val="both"/>
-        <w:rPr>
-          <w:rFonts w:ascii="Times New Roman" w:hAnsi="Times New Roman" w:cs="Times New Roman"/>
-          <w:lang w:val="vi-VN"/>
-        </w:rPr>
-      </w:pPr>
-      <w:r>
-        <w:rPr>
-          <w:rFonts w:cs="Times New Roman" w:ascii="Times New Roman" w:hAnsi="Times New Roman"/>
-          <w:lang w:val="vi-VN"/>
-        </w:rPr>
-        <w:t>Analyze customer and system requirements</w:t>
-      </w:r>
-    </w:p>
-    <w:p>
-      <w:pPr>
-        <w:pStyle w:val="ListParagraph"/>
-        <w:numPr>
-          <w:ilvl w:val="0"/>
-          <w:numId w:val="6"/>
-        </w:numPr>
-        <w:tabs>
-          <w:tab w:val="clear" w:pos="720"/>
-          <w:tab w:val="right" w:pos="10426" w:leader="none"/>
-        </w:tabs>
-        <w:spacing w:before="0" w:after="0"/>
-        <w:ind w:hanging="270" w:left="720"/>
-        <w:contextualSpacing/>
-        <w:jc w:val="both"/>
-        <w:rPr>
-          <w:rFonts w:ascii="Times New Roman" w:hAnsi="Times New Roman" w:cs="Times New Roman"/>
-          <w:lang w:val="vi-VN"/>
-        </w:rPr>
-      </w:pPr>
-      <w:r>
-        <w:rPr>
-          <w:rFonts w:cs="Times New Roman" w:ascii="Times New Roman" w:hAnsi="Times New Roman"/>
-          <w:lang w:val="vi-VN"/>
-        </w:rPr>
-        <w:t>Refine and specify software components requirements</w:t>
-      </w:r>
-    </w:p>
-    <w:p>
-      <w:pPr>
-        <w:pStyle w:val="ListParagraph"/>
-        <w:numPr>
-          <w:ilvl w:val="0"/>
-          <w:numId w:val="6"/>
-        </w:numPr>
-        <w:tabs>
-          <w:tab w:val="clear" w:pos="720"/>
-          <w:tab w:val="right" w:pos="10426" w:leader="none"/>
-        </w:tabs>
-        <w:spacing w:before="0" w:after="0"/>
-        <w:ind w:hanging="270" w:left="720"/>
-        <w:contextualSpacing/>
-        <w:jc w:val="both"/>
-        <w:rPr>
-          <w:rFonts w:ascii="Times New Roman" w:hAnsi="Times New Roman" w:cs="Times New Roman"/>
-          <w:lang w:val="vi-VN"/>
-        </w:rPr>
-      </w:pPr>
-      <w:r>
-        <w:rPr>
-          <w:rFonts w:cs="Times New Roman" w:ascii="Times New Roman" w:hAnsi="Times New Roman"/>
-          <w:lang w:val="vi-VN"/>
-        </w:rPr>
-        <w:t>Participate in software architecture and design</w:t>
-      </w:r>
-    </w:p>
-    <w:p>
-      <w:pPr>
-        <w:pStyle w:val="ListParagraph"/>
-        <w:numPr>
-          <w:ilvl w:val="0"/>
-          <w:numId w:val="6"/>
-        </w:numPr>
-        <w:tabs>
-          <w:tab w:val="clear" w:pos="720"/>
-          <w:tab w:val="right" w:pos="10426" w:leader="none"/>
-        </w:tabs>
-        <w:spacing w:before="0" w:after="0"/>
-        <w:ind w:hanging="270" w:left="720"/>
-        <w:contextualSpacing/>
-        <w:jc w:val="both"/>
-        <w:rPr>
-          <w:rFonts w:ascii="Times New Roman" w:hAnsi="Times New Roman" w:cs="Times New Roman"/>
-          <w:lang w:val="vi-VN"/>
-        </w:rPr>
-      </w:pPr>
-      <w:r>
-        <w:rPr>
-          <w:rFonts w:cs="Times New Roman" w:ascii="Times New Roman" w:hAnsi="Times New Roman"/>
-          <w:lang w:val="vi-VN"/>
-        </w:rPr>
-        <w:t>Responsible for software implementation, unit test and integration test</w:t>
-      </w:r>
-    </w:p>
-    <w:p>
-      <w:pPr>
-        <w:pStyle w:val="ListParagraph"/>
-        <w:numPr>
-          <w:ilvl w:val="0"/>
-          <w:numId w:val="6"/>
-        </w:numPr>
-        <w:tabs>
-          <w:tab w:val="clear" w:pos="720"/>
-          <w:tab w:val="right" w:pos="10426" w:leader="none"/>
-        </w:tabs>
-        <w:spacing w:before="0" w:after="0"/>
-        <w:ind w:hanging="270" w:left="720"/>
-        <w:contextualSpacing/>
-        <w:jc w:val="both"/>
-        <w:rPr>
-          <w:rFonts w:ascii="Times New Roman" w:hAnsi="Times New Roman" w:cs="Times New Roman"/>
-          <w:lang w:val="vi-VN"/>
-        </w:rPr>
-      </w:pPr>
-      <w:r>
-        <w:rPr>
-          <w:rFonts w:cs="Times New Roman" w:ascii="Times New Roman" w:hAnsi="Times New Roman"/>
-          <w:lang w:val="vi-VN"/>
-        </w:rPr>
-        <w:t>Problem analysis and resolve defects</w:t>
-      </w:r>
-    </w:p>
-    <w:p>
-      <w:pPr>
-        <w:pStyle w:val="ListParagraph"/>
-        <w:numPr>
-          <w:ilvl w:val="0"/>
-          <w:numId w:val="5"/>
-        </w:numPr>
-        <w:tabs>
-          <w:tab w:val="clear" w:pos="720"/>
-          <w:tab w:val="right" w:pos="10426" w:leader="none"/>
-        </w:tabs>
-        <w:spacing w:before="0" w:after="0"/>
-        <w:ind w:hanging="360" w:left="450"/>
-        <w:contextualSpacing/>
-        <w:jc w:val="both"/>
-        <w:rPr>
-          <w:rFonts w:ascii="Times New Roman" w:hAnsi="Times New Roman" w:cs="Times New Roman"/>
-          <w:lang w:val="vi-VN"/>
-        </w:rPr>
-      </w:pPr>
-      <w:r>
-        <w:rPr>
-          <w:rFonts w:cs="Times New Roman" w:ascii="Times New Roman" w:hAnsi="Times New Roman"/>
-          <w:lang w:val="vi-VN"/>
-        </w:rPr>
-        <w:t>Lead a functional team of 3, providing consultations and reviews to ensure timely deliveries</w:t>
-      </w:r>
-    </w:p>
-    <w:p>
-      <w:pPr>
-        <w:pStyle w:val="ListParagraph"/>
-        <w:numPr>
-          <w:ilvl w:val="0"/>
-          <w:numId w:val="5"/>
-        </w:numPr>
-        <w:tabs>
-          <w:tab w:val="clear" w:pos="720"/>
-          <w:tab w:val="right" w:pos="10426" w:leader="none"/>
-        </w:tabs>
-        <w:spacing w:before="0" w:after="0"/>
-        <w:ind w:hanging="360" w:left="450"/>
-        <w:contextualSpacing/>
-        <w:jc w:val="both"/>
-        <w:rPr>
-          <w:rFonts w:ascii="Times New Roman" w:hAnsi="Times New Roman" w:cs="Times New Roman"/>
-          <w:lang w:val="vi-VN"/>
-        </w:rPr>
-      </w:pPr>
-      <w:r>
-        <w:rPr>
-          <w:rFonts w:cs="Times New Roman" w:ascii="Times New Roman" w:hAnsi="Times New Roman"/>
-          <w:lang w:val="vi-VN"/>
-        </w:rPr>
-        <w:t>Conducted several training sessions for internal and external engineers</w:t>
-      </w:r>
-    </w:p>
-    <w:p>
-      <w:pPr>
-        <w:pStyle w:val="ListParagraph"/>
-        <w:numPr>
-          <w:ilvl w:val="0"/>
-          <w:numId w:val="5"/>
-        </w:numPr>
-        <w:tabs>
-          <w:tab w:val="clear" w:pos="720"/>
-          <w:tab w:val="right" w:pos="10426" w:leader="none"/>
-        </w:tabs>
-        <w:spacing w:before="0" w:after="0"/>
-        <w:ind w:hanging="360" w:left="450"/>
-        <w:contextualSpacing/>
-        <w:jc w:val="both"/>
-        <w:rPr>
-          <w:rFonts w:ascii="Times New Roman" w:hAnsi="Times New Roman" w:cs="Times New Roman"/>
-          <w:lang w:val="vi-VN"/>
-        </w:rPr>
-      </w:pPr>
-      <w:r>
-        <w:rPr>
-          <w:rFonts w:cs="Times New Roman" w:ascii="Times New Roman" w:hAnsi="Times New Roman"/>
-          <w:lang w:val="vi-VN"/>
-        </w:rPr>
-        <w:t>On-site support in Japan</w:t>
-      </w:r>
-    </w:p>
-    <w:p>
-      <w:pPr>
-        <w:pStyle w:val="Normal"/>
-        <w:tabs>
-          <w:tab w:val="clear" w:pos="720"/>
-          <w:tab w:val="right" w:pos="10426" w:leader="none"/>
-        </w:tabs>
-        <w:spacing w:before="120" w:after="0"/>
-        <w:jc w:val="both"/>
-        <w:rPr>
-          <w:rFonts w:ascii="Times New Roman" w:hAnsi="Times New Roman" w:cs="Times New Roman"/>
-          <w:b/>
-          <w:lang w:val="vi-VN"/>
-        </w:rPr>
-      </w:pPr>
-      <w:r>
-        <w:rPr>
-          <w:rFonts w:cs="Times New Roman" w:ascii="Times New Roman" w:hAnsi="Times New Roman"/>
-          <w:b/>
-          <w:lang w:val="vi-VN"/>
-        </w:rPr>
-        <w:t>Achievement</w:t>
-      </w:r>
-    </w:p>
-    <w:p>
-      <w:pPr>
-        <w:pStyle w:val="ListParagraph"/>
-        <w:numPr>
-          <w:ilvl w:val="0"/>
-          <w:numId w:val="7"/>
-        </w:numPr>
-        <w:tabs>
-          <w:tab w:val="clear" w:pos="720"/>
-          <w:tab w:val="right" w:pos="10426" w:leader="none"/>
-        </w:tabs>
-        <w:spacing w:before="0" w:after="0"/>
-        <w:ind w:hanging="360" w:left="450"/>
-        <w:contextualSpacing/>
-        <w:jc w:val="both"/>
-        <w:rPr>
-          <w:rFonts w:ascii="Times New Roman" w:hAnsi="Times New Roman" w:cs="Times New Roman"/>
-          <w:lang w:val="vi-VN"/>
-        </w:rPr>
-      </w:pPr>
-      <w:r>
-        <w:rPr>
-          <w:rFonts w:cs="Times New Roman" w:ascii="Times New Roman" w:hAnsi="Times New Roman"/>
-          <w:lang w:val="vi-VN"/>
-        </w:rPr>
-        <w:t>Acknowledged for contributing to on-time software delivery for GWM customer (key customer in Bosch, China)</w:t>
-      </w:r>
-    </w:p>
-    <w:p>
-      <w:pPr>
-        <w:pStyle w:val="ListParagraph"/>
-        <w:numPr>
-          <w:ilvl w:val="0"/>
-          <w:numId w:val="7"/>
-        </w:numPr>
-        <w:tabs>
-          <w:tab w:val="clear" w:pos="720"/>
-          <w:tab w:val="right" w:pos="10426" w:leader="none"/>
-        </w:tabs>
-        <w:spacing w:before="0" w:after="0"/>
-        <w:ind w:hanging="360" w:left="450"/>
-        <w:contextualSpacing/>
-        <w:jc w:val="both"/>
-        <w:rPr>
-          <w:rFonts w:ascii="Times New Roman" w:hAnsi="Times New Roman" w:cs="Times New Roman"/>
-          <w:lang w:val="vi-VN"/>
-        </w:rPr>
-      </w:pPr>
-      <w:r>
-        <w:rPr>
-          <w:rFonts w:cs="Times New Roman" w:ascii="Times New Roman" w:hAnsi="Times New Roman"/>
-          <w:lang w:val="vi-VN"/>
-        </w:rPr>
-        <w:t>Successfully transitioned projects from China to Vietnam, increasing from 8 projects in 2018 to over 30 projects in 2020</w:t>
-      </w:r>
-    </w:p>
-    <w:p>
-      <w:pPr>
-        <w:pStyle w:val="ListParagraph"/>
-        <w:numPr>
-          <w:ilvl w:val="0"/>
-          <w:numId w:val="7"/>
-        </w:numPr>
-        <w:tabs>
-          <w:tab w:val="clear" w:pos="720"/>
-          <w:tab w:val="right" w:pos="10426" w:leader="none"/>
-        </w:tabs>
-        <w:spacing w:before="0" w:after="0"/>
-        <w:ind w:hanging="360" w:left="450"/>
-        <w:contextualSpacing/>
-        <w:jc w:val="both"/>
-        <w:rPr>
-          <w:rFonts w:ascii="Times New Roman" w:hAnsi="Times New Roman" w:cs="Times New Roman"/>
-          <w:lang w:val="vi-VN"/>
-        </w:rPr>
-      </w:pPr>
-      <w:r>
-        <w:rPr>
-          <w:rFonts w:cs="Times New Roman" w:ascii="Times New Roman" w:hAnsi="Times New Roman"/>
-          <w:lang w:val="vi-VN"/>
-        </w:rPr>
-        <w:t>Effectively scaled up the competence of Vietnam team, growing from 7 members in 2018 to over 40 members in 2020</w:t>
+          <w:lang w:val="vi-VN"/>
+        </w:rPr>
+      </w:pPr>
+      <w:r>
+        <w:rPr>
+          <w:rFonts w:cs="Times New Roman" w:ascii="Times New Roman" w:hAnsi="Times New Roman"/>
+          <w:lang w:val="vi-VN"/>
+        </w:rPr>
+        <w:t>Acknowledged for establishing and maintaining CI/CT pipeline and share for other teams.</w:t>
       </w:r>
     </w:p>
     <w:sectPr>
@@ -1516,7 +1652,7 @@
     <w:lvl w:ilvl="0">
       <w:start w:val="1"/>
       <w:numFmt w:val="bullet"/>
-      <w:lvlText w:val=""/>
+      <w:lvlText w:val="o"/>
       <w:lvlJc w:val="left"/>
       <w:pPr>
         <w:tabs>
@@ -1525,7 +1661,7 @@
         <w:ind w:left="720" w:hanging="360"/>
       </w:pPr>
       <w:rPr>
-        <w:rFonts w:ascii="Symbol" w:hAnsi="Symbol" w:cs="Symbol" w:hint="default"/>
+        <w:rFonts w:ascii="Courier New" w:hAnsi="Courier New" w:cs="Courier New" w:hint="default"/>
       </w:rPr>
     </w:lvl>
     <w:lvl w:ilvl="1">
@@ -1653,7 +1789,7 @@
     <w:lvl w:ilvl="0">
       <w:start w:val="1"/>
       <w:numFmt w:val="bullet"/>
-      <w:lvlText w:val="o"/>
+      <w:lvlText w:val=""/>
       <w:lvlJc w:val="left"/>
       <w:pPr>
         <w:tabs>
@@ -1662,7 +1798,7 @@
         <w:ind w:left="720" w:hanging="360"/>
       </w:pPr>
       <w:rPr>
-        <w:rFonts w:ascii="Courier New" w:hAnsi="Courier New" w:cs="Courier New" w:hint="default"/>
+        <w:rFonts w:ascii="Symbol" w:hAnsi="Symbol" w:cs="Symbol" w:hint="default"/>
       </w:rPr>
     </w:lvl>
     <w:lvl w:ilvl="1">
@@ -1790,7 +1926,7 @@
     <w:lvl w:ilvl="0">
       <w:start w:val="1"/>
       <w:numFmt w:val="bullet"/>
-      <w:lvlText w:val="o"/>
+      <w:lvlText w:val=""/>
       <w:lvlJc w:val="left"/>
       <w:pPr>
         <w:tabs>
@@ -1799,7 +1935,7 @@
         <w:ind w:left="720" w:hanging="360"/>
       </w:pPr>
       <w:rPr>
-        <w:rFonts w:ascii="Courier New" w:hAnsi="Courier New" w:cs="Courier New" w:hint="default"/>
+        <w:rFonts w:ascii="Symbol" w:hAnsi="Symbol" w:cs="Symbol" w:hint="default"/>
       </w:rPr>
     </w:lvl>
     <w:lvl w:ilvl="1">
@@ -1924,417 +2060,6 @@
     </w:lvl>
   </w:abstractNum>
   <w:abstractNum w:abstractNumId="5">
-    <w:lvl w:ilvl="0">
-      <w:start w:val="1"/>
-      <w:numFmt w:val="bullet"/>
-      <w:lvlText w:val=""/>
-      <w:lvlJc w:val="left"/>
-      <w:pPr>
-        <w:tabs>
-          <w:tab w:val="num" w:pos="0"/>
-        </w:tabs>
-        <w:ind w:left="720" w:hanging="360"/>
-      </w:pPr>
-      <w:rPr>
-        <w:rFonts w:ascii="Symbol" w:hAnsi="Symbol" w:cs="Symbol" w:hint="default"/>
-      </w:rPr>
-    </w:lvl>
-    <w:lvl w:ilvl="1">
-      <w:start w:val="1"/>
-      <w:numFmt w:val="bullet"/>
-      <w:lvlText w:val="o"/>
-      <w:lvlJc w:val="left"/>
-      <w:pPr>
-        <w:tabs>
-          <w:tab w:val="num" w:pos="0"/>
-        </w:tabs>
-        <w:ind w:left="1440" w:hanging="360"/>
-      </w:pPr>
-      <w:rPr>
-        <w:rFonts w:ascii="Courier New" w:hAnsi="Courier New" w:cs="Courier New" w:hint="default"/>
-      </w:rPr>
-    </w:lvl>
-    <w:lvl w:ilvl="2">
-      <w:start w:val="1"/>
-      <w:numFmt w:val="bullet"/>
-      <w:lvlText w:val=""/>
-      <w:lvlJc w:val="left"/>
-      <w:pPr>
-        <w:tabs>
-          <w:tab w:val="num" w:pos="0"/>
-        </w:tabs>
-        <w:ind w:left="2160" w:hanging="360"/>
-      </w:pPr>
-      <w:rPr>
-        <w:rFonts w:ascii="Wingdings" w:hAnsi="Wingdings" w:cs="Wingdings" w:hint="default"/>
-      </w:rPr>
-    </w:lvl>
-    <w:lvl w:ilvl="3">
-      <w:start w:val="1"/>
-      <w:numFmt w:val="bullet"/>
-      <w:lvlText w:val=""/>
-      <w:lvlJc w:val="left"/>
-      <w:pPr>
-        <w:tabs>
-          <w:tab w:val="num" w:pos="0"/>
-        </w:tabs>
-        <w:ind w:left="2880" w:hanging="360"/>
-      </w:pPr>
-      <w:rPr>
-        <w:rFonts w:ascii="Symbol" w:hAnsi="Symbol" w:cs="Symbol" w:hint="default"/>
-      </w:rPr>
-    </w:lvl>
-    <w:lvl w:ilvl="4">
-      <w:start w:val="1"/>
-      <w:numFmt w:val="bullet"/>
-      <w:lvlText w:val="o"/>
-      <w:lvlJc w:val="left"/>
-      <w:pPr>
-        <w:tabs>
-          <w:tab w:val="num" w:pos="0"/>
-        </w:tabs>
-        <w:ind w:left="3600" w:hanging="360"/>
-      </w:pPr>
-      <w:rPr>
-        <w:rFonts w:ascii="Courier New" w:hAnsi="Courier New" w:cs="Courier New" w:hint="default"/>
-      </w:rPr>
-    </w:lvl>
-    <w:lvl w:ilvl="5">
-      <w:start w:val="1"/>
-      <w:numFmt w:val="bullet"/>
-      <w:lvlText w:val=""/>
-      <w:lvlJc w:val="left"/>
-      <w:pPr>
-        <w:tabs>
-          <w:tab w:val="num" w:pos="0"/>
-        </w:tabs>
-        <w:ind w:left="4320" w:hanging="360"/>
-      </w:pPr>
-      <w:rPr>
-        <w:rFonts w:ascii="Wingdings" w:hAnsi="Wingdings" w:cs="Wingdings" w:hint="default"/>
-      </w:rPr>
-    </w:lvl>
-    <w:lvl w:ilvl="6">
-      <w:start w:val="1"/>
-      <w:numFmt w:val="bullet"/>
-      <w:lvlText w:val=""/>
-      <w:lvlJc w:val="left"/>
-      <w:pPr>
-        <w:tabs>
-          <w:tab w:val="num" w:pos="0"/>
-        </w:tabs>
-        <w:ind w:left="5040" w:hanging="360"/>
-      </w:pPr>
-      <w:rPr>
-        <w:rFonts w:ascii="Symbol" w:hAnsi="Symbol" w:cs="Symbol" w:hint="default"/>
-      </w:rPr>
-    </w:lvl>
-    <w:lvl w:ilvl="7">
-      <w:start w:val="1"/>
-      <w:numFmt w:val="bullet"/>
-      <w:lvlText w:val="o"/>
-      <w:lvlJc w:val="left"/>
-      <w:pPr>
-        <w:tabs>
-          <w:tab w:val="num" w:pos="0"/>
-        </w:tabs>
-        <w:ind w:left="5760" w:hanging="360"/>
-      </w:pPr>
-      <w:rPr>
-        <w:rFonts w:ascii="Courier New" w:hAnsi="Courier New" w:cs="Courier New" w:hint="default"/>
-      </w:rPr>
-    </w:lvl>
-    <w:lvl w:ilvl="8">
-      <w:start w:val="1"/>
-      <w:numFmt w:val="bullet"/>
-      <w:lvlText w:val=""/>
-      <w:lvlJc w:val="left"/>
-      <w:pPr>
-        <w:tabs>
-          <w:tab w:val="num" w:pos="0"/>
-        </w:tabs>
-        <w:ind w:left="6480" w:hanging="360"/>
-      </w:pPr>
-      <w:rPr>
-        <w:rFonts w:ascii="Wingdings" w:hAnsi="Wingdings" w:cs="Wingdings" w:hint="default"/>
-      </w:rPr>
-    </w:lvl>
-  </w:abstractNum>
-  <w:abstractNum w:abstractNumId="6">
-    <w:lvl w:ilvl="0">
-      <w:start w:val="1"/>
-      <w:numFmt w:val="bullet"/>
-      <w:lvlText w:val="o"/>
-      <w:lvlJc w:val="left"/>
-      <w:pPr>
-        <w:tabs>
-          <w:tab w:val="num" w:pos="0"/>
-        </w:tabs>
-        <w:ind w:left="720" w:hanging="360"/>
-      </w:pPr>
-      <w:rPr>
-        <w:rFonts w:ascii="Courier New" w:hAnsi="Courier New" w:cs="Courier New" w:hint="default"/>
-      </w:rPr>
-    </w:lvl>
-    <w:lvl w:ilvl="1">
-      <w:start w:val="1"/>
-      <w:numFmt w:val="bullet"/>
-      <w:lvlText w:val="o"/>
-      <w:lvlJc w:val="left"/>
-      <w:pPr>
-        <w:tabs>
-          <w:tab w:val="num" w:pos="0"/>
-        </w:tabs>
-        <w:ind w:left="1440" w:hanging="360"/>
-      </w:pPr>
-      <w:rPr>
-        <w:rFonts w:ascii="Courier New" w:hAnsi="Courier New" w:cs="Courier New" w:hint="default"/>
-      </w:rPr>
-    </w:lvl>
-    <w:lvl w:ilvl="2">
-      <w:start w:val="1"/>
-      <w:numFmt w:val="bullet"/>
-      <w:lvlText w:val=""/>
-      <w:lvlJc w:val="left"/>
-      <w:pPr>
-        <w:tabs>
-          <w:tab w:val="num" w:pos="0"/>
-        </w:tabs>
-        <w:ind w:left="2160" w:hanging="360"/>
-      </w:pPr>
-      <w:rPr>
-        <w:rFonts w:ascii="Wingdings" w:hAnsi="Wingdings" w:cs="Wingdings" w:hint="default"/>
-      </w:rPr>
-    </w:lvl>
-    <w:lvl w:ilvl="3">
-      <w:start w:val="1"/>
-      <w:numFmt w:val="bullet"/>
-      <w:lvlText w:val=""/>
-      <w:lvlJc w:val="left"/>
-      <w:pPr>
-        <w:tabs>
-          <w:tab w:val="num" w:pos="0"/>
-        </w:tabs>
-        <w:ind w:left="2880" w:hanging="360"/>
-      </w:pPr>
-      <w:rPr>
-        <w:rFonts w:ascii="Symbol" w:hAnsi="Symbol" w:cs="Symbol" w:hint="default"/>
-      </w:rPr>
-    </w:lvl>
-    <w:lvl w:ilvl="4">
-      <w:start w:val="1"/>
-      <w:numFmt w:val="bullet"/>
-      <w:lvlText w:val="o"/>
-      <w:lvlJc w:val="left"/>
-      <w:pPr>
-        <w:tabs>
-          <w:tab w:val="num" w:pos="0"/>
-        </w:tabs>
-        <w:ind w:left="3600" w:hanging="360"/>
-      </w:pPr>
-      <w:rPr>
-        <w:rFonts w:ascii="Courier New" w:hAnsi="Courier New" w:cs="Courier New" w:hint="default"/>
-      </w:rPr>
-    </w:lvl>
-    <w:lvl w:ilvl="5">
-      <w:start w:val="1"/>
-      <w:numFmt w:val="bullet"/>
-      <w:lvlText w:val=""/>
-      <w:lvlJc w:val="left"/>
-      <w:pPr>
-        <w:tabs>
-          <w:tab w:val="num" w:pos="0"/>
-        </w:tabs>
-        <w:ind w:left="4320" w:hanging="360"/>
-      </w:pPr>
-      <w:rPr>
-        <w:rFonts w:ascii="Wingdings" w:hAnsi="Wingdings" w:cs="Wingdings" w:hint="default"/>
-      </w:rPr>
-    </w:lvl>
-    <w:lvl w:ilvl="6">
-      <w:start w:val="1"/>
-      <w:numFmt w:val="bullet"/>
-      <w:lvlText w:val=""/>
-      <w:lvlJc w:val="left"/>
-      <w:pPr>
-        <w:tabs>
-          <w:tab w:val="num" w:pos="0"/>
-        </w:tabs>
-        <w:ind w:left="5040" w:hanging="360"/>
-      </w:pPr>
-      <w:rPr>
-        <w:rFonts w:ascii="Symbol" w:hAnsi="Symbol" w:cs="Symbol" w:hint="default"/>
-      </w:rPr>
-    </w:lvl>
-    <w:lvl w:ilvl="7">
-      <w:start w:val="1"/>
-      <w:numFmt w:val="bullet"/>
-      <w:lvlText w:val="o"/>
-      <w:lvlJc w:val="left"/>
-      <w:pPr>
-        <w:tabs>
-          <w:tab w:val="num" w:pos="0"/>
-        </w:tabs>
-        <w:ind w:left="5760" w:hanging="360"/>
-      </w:pPr>
-      <w:rPr>
-        <w:rFonts w:ascii="Courier New" w:hAnsi="Courier New" w:cs="Courier New" w:hint="default"/>
-      </w:rPr>
-    </w:lvl>
-    <w:lvl w:ilvl="8">
-      <w:start w:val="1"/>
-      <w:numFmt w:val="bullet"/>
-      <w:lvlText w:val=""/>
-      <w:lvlJc w:val="left"/>
-      <w:pPr>
-        <w:tabs>
-          <w:tab w:val="num" w:pos="0"/>
-        </w:tabs>
-        <w:ind w:left="6480" w:hanging="360"/>
-      </w:pPr>
-      <w:rPr>
-        <w:rFonts w:ascii="Wingdings" w:hAnsi="Wingdings" w:cs="Wingdings" w:hint="default"/>
-      </w:rPr>
-    </w:lvl>
-  </w:abstractNum>
-  <w:abstractNum w:abstractNumId="7">
-    <w:lvl w:ilvl="0">
-      <w:start w:val="1"/>
-      <w:numFmt w:val="bullet"/>
-      <w:lvlText w:val=""/>
-      <w:lvlJc w:val="left"/>
-      <w:pPr>
-        <w:tabs>
-          <w:tab w:val="num" w:pos="0"/>
-        </w:tabs>
-        <w:ind w:left="720" w:hanging="360"/>
-      </w:pPr>
-      <w:rPr>
-        <w:rFonts w:ascii="Symbol" w:hAnsi="Symbol" w:cs="Symbol" w:hint="default"/>
-      </w:rPr>
-    </w:lvl>
-    <w:lvl w:ilvl="1">
-      <w:start w:val="1"/>
-      <w:numFmt w:val="bullet"/>
-      <w:lvlText w:val="o"/>
-      <w:lvlJc w:val="left"/>
-      <w:pPr>
-        <w:tabs>
-          <w:tab w:val="num" w:pos="0"/>
-        </w:tabs>
-        <w:ind w:left="1440" w:hanging="360"/>
-      </w:pPr>
-      <w:rPr>
-        <w:rFonts w:ascii="Courier New" w:hAnsi="Courier New" w:cs="Courier New" w:hint="default"/>
-      </w:rPr>
-    </w:lvl>
-    <w:lvl w:ilvl="2">
-      <w:start w:val="1"/>
-      <w:numFmt w:val="bullet"/>
-      <w:lvlText w:val=""/>
-      <w:lvlJc w:val="left"/>
-      <w:pPr>
-        <w:tabs>
-          <w:tab w:val="num" w:pos="0"/>
-        </w:tabs>
-        <w:ind w:left="2160" w:hanging="360"/>
-      </w:pPr>
-      <w:rPr>
-        <w:rFonts w:ascii="Wingdings" w:hAnsi="Wingdings" w:cs="Wingdings" w:hint="default"/>
-      </w:rPr>
-    </w:lvl>
-    <w:lvl w:ilvl="3">
-      <w:start w:val="1"/>
-      <w:numFmt w:val="bullet"/>
-      <w:lvlText w:val=""/>
-      <w:lvlJc w:val="left"/>
-      <w:pPr>
-        <w:tabs>
-          <w:tab w:val="num" w:pos="0"/>
-        </w:tabs>
-        <w:ind w:left="2880" w:hanging="360"/>
-      </w:pPr>
-      <w:rPr>
-        <w:rFonts w:ascii="Symbol" w:hAnsi="Symbol" w:cs="Symbol" w:hint="default"/>
-      </w:rPr>
-    </w:lvl>
-    <w:lvl w:ilvl="4">
-      <w:start w:val="1"/>
-      <w:numFmt w:val="bullet"/>
-      <w:lvlText w:val="o"/>
-      <w:lvlJc w:val="left"/>
-      <w:pPr>
-        <w:tabs>
-          <w:tab w:val="num" w:pos="0"/>
-        </w:tabs>
-        <w:ind w:left="3600" w:hanging="360"/>
-      </w:pPr>
-      <w:rPr>
-        <w:rFonts w:ascii="Courier New" w:hAnsi="Courier New" w:cs="Courier New" w:hint="default"/>
-      </w:rPr>
-    </w:lvl>
-    <w:lvl w:ilvl="5">
-      <w:start w:val="1"/>
-      <w:numFmt w:val="bullet"/>
-      <w:lvlText w:val=""/>
-      <w:lvlJc w:val="left"/>
-      <w:pPr>
-        <w:tabs>
-          <w:tab w:val="num" w:pos="0"/>
-        </w:tabs>
-        <w:ind w:left="4320" w:hanging="360"/>
-      </w:pPr>
-      <w:rPr>
-        <w:rFonts w:ascii="Wingdings" w:hAnsi="Wingdings" w:cs="Wingdings" w:hint="default"/>
-      </w:rPr>
-    </w:lvl>
-    <w:lvl w:ilvl="6">
-      <w:start w:val="1"/>
-      <w:numFmt w:val="bullet"/>
-      <w:lvlText w:val=""/>
-      <w:lvlJc w:val="left"/>
-      <w:pPr>
-        <w:tabs>
-          <w:tab w:val="num" w:pos="0"/>
-        </w:tabs>
-        <w:ind w:left="5040" w:hanging="360"/>
-      </w:pPr>
-      <w:rPr>
-        <w:rFonts w:ascii="Symbol" w:hAnsi="Symbol" w:cs="Symbol" w:hint="default"/>
-      </w:rPr>
-    </w:lvl>
-    <w:lvl w:ilvl="7">
-      <w:start w:val="1"/>
-      <w:numFmt w:val="bullet"/>
-      <w:lvlText w:val="o"/>
-      <w:lvlJc w:val="left"/>
-      <w:pPr>
-        <w:tabs>
-          <w:tab w:val="num" w:pos="0"/>
-        </w:tabs>
-        <w:ind w:left="5760" w:hanging="360"/>
-      </w:pPr>
-      <w:rPr>
-        <w:rFonts w:ascii="Courier New" w:hAnsi="Courier New" w:cs="Courier New" w:hint="default"/>
-      </w:rPr>
-    </w:lvl>
-    <w:lvl w:ilvl="8">
-      <w:start w:val="1"/>
-      <w:numFmt w:val="bullet"/>
-      <w:lvlText w:val=""/>
-      <w:lvlJc w:val="left"/>
-      <w:pPr>
-        <w:tabs>
-          <w:tab w:val="num" w:pos="0"/>
-        </w:tabs>
-        <w:ind w:left="6480" w:hanging="360"/>
-      </w:pPr>
-      <w:rPr>
-        <w:rFonts w:ascii="Wingdings" w:hAnsi="Wingdings" w:cs="Wingdings" w:hint="default"/>
-      </w:rPr>
-    </w:lvl>
-  </w:abstractNum>
-  <w:abstractNum w:abstractNumId="8">
     <w:lvl w:ilvl="0">
       <w:start w:val="1"/>
       <w:numFmt w:val="none"/>
@@ -2467,15 +2192,6 @@
   </w:num>
   <w:num w:numId="5">
     <w:abstractNumId w:val="5"/>
-  </w:num>
-  <w:num w:numId="6">
-    <w:abstractNumId w:val="6"/>
-  </w:num>
-  <w:num w:numId="7">
-    <w:abstractNumId w:val="7"/>
-  </w:num>
-  <w:num w:numId="8">
-    <w:abstractNumId w:val="8"/>
   </w:num>
 </w:numbering>
 </file>

</xml_diff>